<commit_message>
sync: update skills+thresholds+hooks+scripts+docs (163 files) [src 757d45f6]
</commit_message>
<xml_diff>
--- a/.claude/skills/user-manual/assets/user-manual-reference.docx
+++ b/.claude/skills/user-manual/assets/user-manual-reference.docx
@@ -224,7 +224,7 @@
         <w:rFonts w:asciiTheme="minorHAnsi" w:eastAsiaTheme="minorEastAsia" w:hAnsiTheme="minorHAnsi" w:cstheme="minorBidi"/>
         <w:sz w:val="22"/>
         <w:szCs w:val="22"/>
-        <w:lang w:val="en-US" w:eastAsia="en-US" w:bidi="ar-SA"/>
+        <w:lang w:val="en-US" w:eastAsia="zh-CN" w:bidi="ar-SA"/>
       </w:rPr>
     </w:rPrDefault>
     <w:pPrDefault>
@@ -23962,11 +23962,11 @@
     <a:fontScheme name="Office">
       <a:majorFont>
         <a:latin typeface="Calibri"/>
-        <a:ea typeface=""/>
+        <a:ea typeface="Microsoft YaHei"/>
         <a:cs typeface=""/>
         <a:font script="Jpan" typeface="ＭＳ ゴシック"/>
         <a:font script="Hang" typeface="맑은 고딕"/>
-        <a:font script="Hans" typeface="宋体"/>
+        <a:font script="Hans" typeface="Microsoft YaHei"/>
         <a:font script="Hant" typeface="新細明體"/>
         <a:font script="Arab" typeface="Times New Roman"/>
         <a:font script="Hebr" typeface="Times New Roman"/>
@@ -23997,11 +23997,11 @@
       </a:majorFont>
       <a:minorFont>
         <a:latin typeface="Cambria"/>
-        <a:ea typeface=""/>
+        <a:ea typeface="Microsoft YaHei"/>
         <a:cs typeface=""/>
         <a:font script="Jpan" typeface="ＭＳ 明朝"/>
         <a:font script="Hang" typeface="맑은 고딕"/>
-        <a:font script="Hans" typeface="宋体"/>
+        <a:font script="Hans" typeface="Microsoft YaHei"/>
         <a:font script="Hant" typeface="新細明體"/>
         <a:font script="Arab" typeface="Arial"/>
         <a:font script="Hebr" typeface="Arial"/>

</xml_diff>